<commit_message>
Add root README, search and screening log, update thesis manuscript
</commit_message>
<xml_diff>
--- a/RASOLOSOA_Jimmy_Thesis.docx
+++ b/RASOLOSOA_Jimmy_Thesis.docx
@@ -472,7 +472,7 @@
     </w:p>
     <w:sdt>
       <w:sdtPr>
-        <w:id w:val="1700619178"/>
+        <w:id w:val="-1225539628"/>
         <w:docPartObj>
           <w:docPartGallery w:val="Table of Contents"/>
           <w:docPartUnique w:val="1"/>
@@ -7610,12 +7610,23 @@
           <w:szCs w:val="22"/>
           <w:rtl w:val="0"/>
         </w:rPr>
-        <w:t xml:space="preserve">The search covered work published between 2019 and 2026, and admitted earlier sources by backward snowballing where they set the normative baseline or supplied a core analytical construct. Scopus, Miage Scholar, Web of Science and Google Scholar were searched for peer-reviewed work. Institutional material was collected from the Bank for International Settlements (BIS), the European Central Bank (ECB), the Committee on Payments and Market Infrastructures together with IOSCO (CPMI-IOSCO), and from the national central banks that ran the pilots. All searches used the same query:</w:t>
-      </w:r>
-      <w:r>
-        <w:rPr>
-          <w:rtl w:val="0"/>
-        </w:rPr>
+        <w:t>The corpus was built in two ways, each suited to a different register of source. The peer-reviewed layer was assembled by backward snowballing from a seed set: a small number of papers on the economics of DLT-based settlement, on the modelling of settlement risk and on the legal treatment of DLT clearing and settlement, whose reference lists were then followed outwards. The institutional layer was retrieved directly from the bodies that publish it - the Bank for International Settlements (BIS), the European Central Bank (ECB), the Committee on Payments and Market Infrastructures together with IOSCO (CPMI-IOSCO), and the national central banks that ran the pilots - because the documents that decide this question are named publications rather than database records. Snowballing and targeted retrieval are the strategies the multivocal-review guidance recommends where the decisive evidence is grey literature [31]. Coverage runs from 2019 to 2026, with earlier sources admitted where they set the normative baseline or supplied a core analytical construct.</w:t>
+      </w:r>
+    </w:p>
+    <w:p>
+      <w:pPr>
+        <w:rPr/>
+      </w:pPr>
+      <w:r>
+        <w:rPr>
+          <w:rFonts w:ascii="Times New Roman" w:cs="Times New Roman" w:eastAsia="Times New Roman" w:hAnsi="Times New Roman"/>
+          <w:i w:val="0"/>
+          <w:iCs w:val="0"/>
+          <w:sz w:val="22"/>
+          <w:szCs w:val="22"/>
+          <w:rtl w:val="0"/>
+        </w:rPr>
+        <w:t>A structured database search was then run against Scopus, through the MIAGE Scholar interface, to test the coverage of that corpus. It is organised in four layers, each aimed at one face of the research question: the settlement operation, the settlement asset in its wholesale setting, the coordination mechanism, and the settlement operation again in the broader vocabulary of clearing and post-trade. All four are restricted to PUBYEAR &gt; 2018.</w:t>
       </w:r>
     </w:p>
     <w:p>
@@ -7634,12 +7645,83 @@
           <w:szCs w:val="22"/>
           <w:rtl w:val="0"/>
         </w:rPr>
-        <w:t xml:space="preserve">("delivery-versus-payment" OR "settlement finality" OR "atomic settlement") AND ("tokenisation" OR "security token" OR "bond" OR "wholesale CBDC") AND ("DLT" OR "permissioned" OR "regulated")</w:t>
-      </w:r>
-      <w:r>
-        <w:rPr>
-          <w:rtl w:val="0"/>
-        </w:rPr>
+        <w:t>Q1. TITLE-ABS-KEY("delivery-versus-payment" OR "DvP") AND TITLE-ABS-KEY("tokeni*" OR "digital asset*" OR "security token")</w:t>
+      </w:r>
+    </w:p>
+    <w:p>
+      <w:pPr>
+        <w:spacing w:after="160" w:before="80" w:lineRule="auto"/>
+        <w:ind w:left="425" w:right="425" w:firstLine="0"/>
+        <w:jc w:val="left"/>
+        <w:rPr/>
+      </w:pPr>
+      <w:r>
+        <w:rPr>
+          <w:rFonts w:ascii="Times New Roman" w:cs="Times New Roman" w:eastAsia="Times New Roman" w:hAnsi="Times New Roman"/>
+          <w:i w:val="1"/>
+          <w:iCs w:val="1"/>
+          <w:sz w:val="22"/>
+          <w:szCs w:val="22"/>
+          <w:rtl w:val="0"/>
+        </w:rPr>
+        <w:t>Q2. TITLE-ABS-KEY("wholesale CBDC" OR "wholesale central bank digital currency" OR "wholesale central bank money" OR "tokenised deposit*" OR "tokenized deposit*") AND TITLE-ABS-KEY("settlement" OR "securities" OR "delivery-versus-payment" OR "DvP")</w:t>
+      </w:r>
+    </w:p>
+    <w:p>
+      <w:pPr>
+        <w:spacing w:after="160" w:before="80" w:lineRule="auto"/>
+        <w:ind w:left="425" w:right="425" w:firstLine="0"/>
+        <w:jc w:val="left"/>
+        <w:rPr/>
+      </w:pPr>
+      <w:r>
+        <w:rPr>
+          <w:rFonts w:ascii="Times New Roman" w:cs="Times New Roman" w:eastAsia="Times New Roman" w:hAnsi="Times New Roman"/>
+          <w:i w:val="1"/>
+          <w:iCs w:val="1"/>
+          <w:sz w:val="22"/>
+          <w:szCs w:val="22"/>
+          <w:rtl w:val="0"/>
+        </w:rPr>
+        <w:t>Q3. TITLE-ABS-KEY("atomic settlement" OR "HTLC" OR "hashed timelock" OR "settlement finality") AND TITLE-ABS-KEY("securities" OR "bond*" OR "DLT" OR "blockchain")</w:t>
+      </w:r>
+    </w:p>
+    <w:p>
+      <w:pPr>
+        <w:spacing w:after="160" w:before="80" w:lineRule="auto"/>
+        <w:ind w:left="425" w:right="425" w:firstLine="0"/>
+        <w:jc w:val="left"/>
+        <w:rPr/>
+      </w:pPr>
+      <w:r>
+        <w:rPr>
+          <w:rFonts w:ascii="Times New Roman" w:cs="Times New Roman" w:eastAsia="Times New Roman" w:hAnsi="Times New Roman"/>
+          <w:i w:val="1"/>
+          <w:iCs w:val="1"/>
+          <w:sz w:val="22"/>
+          <w:szCs w:val="22"/>
+          <w:rtl w:val="0"/>
+        </w:rPr>
+        <w:t>Q4. TITLE-ABS-KEY("securities settlement" OR "clearing and settlement" OR "post-trade" OR "settlement system*") AND TITLE-ABS-KEY("blockchain" OR "distributed ledger" OR "DLT" OR "tokeni*")</w:t>
+      </w:r>
+    </w:p>
+    <w:p>
+      <w:pPr>
+        <w:spacing w:lineRule="auto"/>
+        <w:ind/>
+        <w:jc w:val="both"/>
+        <w:rPr/>
+      </w:pPr>
+      <w:r>
+        <w:rPr>
+          <w:rFonts w:ascii="Times New Roman" w:cs="Times New Roman" w:eastAsia="Times New Roman" w:hAnsi="Times New Roman"/>
+          <w:i w:val="0"/>
+          <w:iCs w:val="1"/>
+          <w:sz w:val="22"/>
+          <w:szCs w:val="22"/>
+          <w:rtl w:val="0"/>
+        </w:rPr>
+        <w:t>The four layers returned three, twenty-three, one hundred and nineteen and one hundred and twenty-two records. The second is the wholesale-scoped form of a broader query on central bank digital currency and settlement, which returns three hundred and forty records dominated by retail CBDC economics that the scope fixed in Section 1.3 excludes as a class; both counts are reported in the log. Every record was screened on title and venue, and on the abstract where the title left the matter open, against the criteria stated below. Two results are worth recording. Five of the eight peer-reviewed sources already in the corpus were returned by the search without having been sought, which is evidence that the snowballed layer is not idiosyncratic. And thirty-nine records were retained as candidates for further reading; the two closest to the research question, a position paper applying the PFMI to blockchain design and a single-model proposal for cross-chain atomic settlement in central bank digital currency, were examined and neither holds a common requirement set constant across several candidate architectures. The gap identified in Section 2.6 therefore stands. The candidates were identified after the corpus was closed and none has been coded into it; the log records every query, every record and every decision with its code and its reason.</w:t>
       </w:r>
     </w:p>
     <w:p>
@@ -7676,12 +7758,7 @@
           <w:szCs w:val="22"/>
           <w:rtl w:val="0"/>
         </w:rPr>
-        <w:t xml:space="preserve">Selection went through four stages, from retrieval to screening on title and abstract, then to a full-text assessment and finally to coding. Twenty-three settlement-relevant sources form the final analytical corpus; the methodological references [29] to [33] sit outside it, and so does the Swiss National Bank's 2025 press release [14b], which is cited in Section 2.3 as a factual update on a pilot already in the corpus and was not coded. The companion coding workbook records what the search returned, which sources were dropped and why, the register each source belongs to, its proximity rating, and the page on which each piece of evidence sits. The review then ran twice over that corpus: a first pass sorted each source and the architecture it describes, and a second pass pulled out requirements, mechanisms, controls and the reasons each source gives. Keeping the two passes apart stops the review from presenting this thesis's own framework as though it had been lifted from one source.</w:t>
-      </w:r>
-      <w:r>
-        <w:rPr>
-          <w:rtl w:val="0"/>
-        </w:rPr>
+        <w:t>Selection was made on the full text rather than through a staged screen of titles and abstracts: the corpus is small, and most of it was known by name before it was retrieved. Twenty-three settlement-relevant sources form the final analytical corpus; the methodological references [29] to [33] sit outside it, and so does the Swiss National Bank's 2025 press release [14b], which is cited in Section 2.3 as a factual update on a pilot already in the corpus and was not coded. For every source in the corpus the companion coding workbook records the register it belongs to, its proximity rating and the page on which each piece of evidence sits, and the companion search and screening log records the queries, the records they returned and the decision taken on each. The review then ran twice over that corpus: a first pass sorted each source and the architecture it describes, and a second pass pulled out requirements, mechanisms, controls and the reasons each source gives. Keeping the two passes apart stops the review from presenting this thesis's own framework as though it had been lifted from one source.</w:t>
       </w:r>
     </w:p>
     <w:tbl>
@@ -7970,7 +8047,7 @@
                 <w:szCs w:val="18"/>
                 <w:rtl w:val="0"/>
               </w:rPr>
-              <w:t xml:space="preserve">Scopus, Web of Science, Google Scholar, BIS, ECB, CPMI-IOSCO and relevant national central banks.</w:t>
+              <w:t>Seed papers retained from earlier reading, extended by backward snowballing; standards and pilot reports retrieved directly from the BIS, the ECB, CPMI-IOSCO and the national central banks. Coverage tested against Scopus through the MIAGE Scholar interface.</w:t>
             </w:r>
             <w:r>
               <w:rPr>
@@ -8168,7 +8245,7 @@
                 <w:szCs w:val="18"/>
                 <w:rtl w:val="0"/>
               </w:rPr>
-              <w:t xml:space="preserve">Retrieval; title/abstract screening; full-text assessment; coding and traceability record.</w:t>
+              <w:t>Screening on title, venue and abstract against the inclusion and exclusion criteria; full-text assessment; coding and traceability record.</w:t>
             </w:r>
             <w:r>
               <w:rPr>
@@ -8235,6 +8312,72 @@
                 <w:rtl w:val="0"/>
               </w:rPr>
               <w:t xml:space="preserve">Twenty-three settlement-relevant sources, supplemented by separate methodological references.</w:t>
+            </w:r>
+            <w:r>
+              <w:rPr>
+                <w:rtl w:val="0"/>
+              </w:rPr>
+            </w:r>
+          </w:p>
+        </w:tc>
+      </w:tr>
+      <w:tr>
+        <w:trPr>
+          <w:cantSplit w:val="1"/>
+          <w:tblHeader w:val="0"/>
+        </w:trPr>
+        <w:tc>
+          <w:tcPr>
+            <w:tcMar>
+              <w:top w:w="90.0" w:type="dxa"/>
+              <w:bottom w:w="90.0" w:type="dxa"/>
+            </w:tcMar>
+            <w:vAlign w:val="center"/>
+          </w:tcPr>
+          <w:p>
+            <w:pPr>
+              <w:spacing w:after="0" w:line="252.00000000000003" w:lineRule="auto"/>
+              <w:jc w:val="left"/>
+              <w:rPr/>
+            </w:pPr>
+            <w:r>
+              <w:rPr>
+                <w:rFonts w:ascii="Times New Roman" w:cs="Times New Roman" w:eastAsia="Times New Roman" w:hAnsi="Times New Roman"/>
+                <w:sz w:val="18"/>
+                <w:szCs w:val="18"/>
+                <w:rtl w:val="0"/>
+              </w:rPr>
+              <w:t>Coverage test</w:t>
+            </w:r>
+            <w:r>
+              <w:rPr>
+                <w:rtl w:val="0"/>
+              </w:rPr>
+            </w:r>
+          </w:p>
+        </w:tc>
+        <w:tc>
+          <w:tcPr>
+            <w:tcMar>
+              <w:top w:w="90.0" w:type="dxa"/>
+              <w:bottom w:w="90.0" w:type="dxa"/>
+            </w:tcMar>
+            <w:vAlign w:val="center"/>
+          </w:tcPr>
+          <w:p>
+            <w:pPr>
+              <w:spacing w:after="0" w:line="252.00000000000003" w:lineRule="auto"/>
+              <w:jc w:val="left"/>
+              <w:rPr/>
+            </w:pPr>
+            <w:r>
+              <w:rPr>
+                <w:rFonts w:ascii="Times New Roman" w:cs="Times New Roman" w:eastAsia="Times New Roman" w:hAnsi="Times New Roman"/>
+                <w:sz w:val="18"/>
+                <w:szCs w:val="18"/>
+                <w:rtl w:val="0"/>
+              </w:rPr>
+              <w:t>Four layered Scopus queries; 267 records screened, 39 recorded as candidates, five sources already in the corpus returned independently. Queries, records and decisions in the companion search and screening log.</w:t>
             </w:r>
             <w:r>
               <w:rPr>
@@ -27741,12 +27884,12 @@
           <wp:inline distB="0" distT="0" distL="114300" distR="114300">
             <wp:extent cx="5760000" cy="3384000"/>
             <wp:effectExtent b="0" l="0" r="0" t="0"/>
-            <wp:docPr descr="Figure 4.1 - Author-constructed generic DvP settlement architecture. Sources informing the synthesis are reported in Table 4.4." id="1" name="image1.png"/>
+            <wp:docPr descr="Figure 4.1 - Author-constructed generic DvP settlement architecture. Sources informing the synthesis are reported in Table 4.4." id="1" name="image3.png"/>
             <a:graphic>
               <a:graphicData uri="http://schemas.openxmlformats.org/drawingml/2006/picture">
                 <pic:pic>
                   <pic:nvPicPr>
-                    <pic:cNvPr descr="Figure 4.1 - Author-constructed generic DvP settlement architecture. Sources informing the synthesis are reported in Table 4.4." id="0" name="image1.png"/>
+                    <pic:cNvPr descr="Figure 4.1 - Author-constructed generic DvP settlement architecture. Sources informing the synthesis are reported in Table 4.4." id="0" name="image3.png"/>
                     <pic:cNvPicPr preferRelativeResize="0"/>
                   </pic:nvPicPr>
                   <pic:blipFill>
@@ -32537,12 +32680,12 @@
           <wp:inline distB="114300" distT="114300" distL="114300" distR="114300">
             <wp:extent cx="9720000" cy="5544000"/>
             <wp:effectExtent b="0" l="0" r="0" t="0"/>
-            <wp:docPr id="5" name="image2.png"/>
+            <wp:docPr id="5" name="image1.png"/>
             <a:graphic>
               <a:graphicData uri="http://schemas.openxmlformats.org/drawingml/2006/picture">
                 <pic:pic>
                   <pic:nvPicPr>
-                    <pic:cNvPr id="0" name="image2.png"/>
+                    <pic:cNvPr id="0" name="image1.png"/>
                     <pic:cNvPicPr preferRelativeResize="0"/>
                   </pic:nvPicPr>
                   <pic:blipFill>
@@ -32687,12 +32830,12 @@
           <wp:inline distB="114300" distT="114300" distL="114300" distR="114300">
             <wp:extent cx="9720000" cy="5695200"/>
             <wp:effectExtent b="0" l="0" r="0" t="0"/>
-            <wp:docPr id="4" name="image3.png"/>
+            <wp:docPr id="4" name="image2.png"/>
             <a:graphic>
               <a:graphicData uri="http://schemas.openxmlformats.org/drawingml/2006/picture">
                 <pic:pic>
                   <pic:nvPicPr>
-                    <pic:cNvPr id="0" name="image3.png"/>
+                    <pic:cNvPr id="0" name="image2.png"/>
                     <pic:cNvPicPr preferRelativeResize="0"/>
                   </pic:nvPicPr>
                   <pic:blipFill>
@@ -42234,44 +42377,7 @@
           <w:szCs w:val="22"/>
           <w:rtl w:val="0"/>
         </w:rPr>
-        <w:t xml:space="preserve">The source code, the deployment scripts and the test suite are published at </w:t>
-      </w:r>
-      <w:r>
-        <w:rPr>
-          <w:i w:val="1"/>
-          <w:iCs w:val="1"/>
-          <w:sz w:val="22"/>
-          <w:szCs w:val="22"/>
-          <w:rtl w:val="0"/>
-        </w:rPr>
-        <w:t xml:space="preserve">https://github.com/Lapocalypsie/POC_THESIS</w:t>
-      </w:r>
-      <w:r>
-        <w:rPr>
-          <w:rFonts w:ascii="Times New Roman" w:cs="Times New Roman" w:eastAsia="Times New Roman" w:hAnsi="Times New Roman"/>
-          <w:i w:val="1"/>
-          <w:iCs w:val="1"/>
-          <w:sz w:val="22"/>
-          <w:szCs w:val="22"/>
-          <w:rtl w:val="0"/>
-        </w:rPr>
-        <w:t xml:space="preserve">.</w:t>
-      </w:r>
-      <w:r>
-        <w:rPr>
-          <w:rFonts w:ascii="Times New Roman" w:cs="Times New Roman" w:eastAsia="Times New Roman" w:hAnsi="Times New Roman"/>
-          <w:i w:val="0"/>
-          <w:iCs w:val="0"/>
-          <w:sz w:val="22"/>
-          <w:szCs w:val="22"/>
-          <w:rtl w:val="0"/>
-        </w:rPr>
-        <w:t xml:space="preserve"> The README states the Fabric version, the topology of the test network, the deployment commands and the single command that runs the ten tests. A reader can therefore reproduce Tables 5.3 to 5.5 without asking for anything further.</w:t>
-      </w:r>
-      <w:r>
-        <w:rPr>
-          <w:rtl w:val="0"/>
-        </w:rPr>
+        <w:t>The source code, the deployment scripts and the test suite are published at https://github.com/Lapocalypsie/POC_THESIS, under 05_PoC/. The README at the root of the repository gives the topology of the test network and the commands, and the fuller README in 05_PoC/ adds the Fabric version, the endorsement policies, the deployment sequence and the single command that runs the ten tests. A reader can therefore reproduce Tables 5.3 to 5.5 without asking for anything further.</w:t>
       </w:r>
     </w:p>
     <w:p>
@@ -46405,6 +46511,102 @@
           </w:p>
         </w:tc>
       </w:tr>
+      <w:tr>
+        <w:trPr>
+          <w:cantSplit w:val="1"/>
+          <w:tblHeader w:val="0"/>
+        </w:trPr>
+        <w:tc>
+          <w:tcPr>
+            <w:tcMar>
+              <w:top w:w="90.0" w:type="dxa"/>
+              <w:bottom w:w="90.0" w:type="dxa"/>
+            </w:tcMar>
+            <w:vAlign w:val="center"/>
+          </w:tcPr>
+          <w:p>
+            <w:pPr>
+              <w:spacing w:after="0" w:line="252.00000000000003" w:lineRule="auto"/>
+              <w:jc w:val="left"/>
+              <w:rPr/>
+            </w:pPr>
+            <w:r>
+              <w:rPr>
+                <w:rFonts w:ascii="Times New Roman" w:cs="Times New Roman" w:eastAsia="Times New Roman" w:hAnsi="Times New Roman"/>
+                <w:sz w:val="18"/>
+                <w:szCs w:val="18"/>
+                <w:rtl w:val="0"/>
+              </w:rPr>
+              <w:t>Search and screening log</w:t>
+            </w:r>
+            <w:r>
+              <w:rPr>
+                <w:rtl w:val="0"/>
+              </w:rPr>
+            </w:r>
+          </w:p>
+        </w:tc>
+        <w:tc>
+          <w:tcPr>
+            <w:tcMar>
+              <w:top w:w="90.0" w:type="dxa"/>
+              <w:bottom w:w="90.0" w:type="dxa"/>
+            </w:tcMar>
+            <w:vAlign w:val="center"/>
+          </w:tcPr>
+          <w:p>
+            <w:pPr>
+              <w:spacing w:after="0" w:line="252.00000000000003" w:lineRule="auto"/>
+              <w:jc w:val="left"/>
+              <w:rPr/>
+            </w:pPr>
+            <w:r>
+              <w:rPr>
+                <w:rFonts w:ascii="Times New Roman" w:cs="Times New Roman" w:eastAsia="Times New Roman" w:hAnsi="Times New Roman"/>
+                <w:sz w:val="18"/>
+                <w:szCs w:val="18"/>
+                <w:rtl w:val="0"/>
+              </w:rPr>
+              <w:t>The four database queries as run, every record they returned, and the decision taken on each against the inclusion and exclusion criteria, with the code and the reason; the candidates recorded for further reading; and the corpus sources the search returned independently (referenced in Chapter 2)</w:t>
+            </w:r>
+            <w:r>
+              <w:rPr>
+                <w:rtl w:val="0"/>
+              </w:rPr>
+            </w:r>
+          </w:p>
+        </w:tc>
+        <w:tc>
+          <w:tcPr>
+            <w:tcMar>
+              <w:top w:w="90.0" w:type="dxa"/>
+              <w:bottom w:w="90.0" w:type="dxa"/>
+            </w:tcMar>
+            <w:vAlign w:val="center"/>
+          </w:tcPr>
+          <w:p>
+            <w:pPr>
+              <w:spacing w:after="0" w:line="252.00000000000003" w:lineRule="auto"/>
+              <w:jc w:val="left"/>
+              <w:rPr/>
+            </w:pPr>
+            <w:r>
+              <w:rPr>
+                <w:rFonts w:ascii="Times New Roman" w:cs="Times New Roman" w:eastAsia="Times New Roman" w:hAnsi="Times New Roman"/>
+                <w:sz w:val="18"/>
+                <w:szCs w:val="18"/>
+                <w:rtl w:val="0"/>
+              </w:rPr>
+              <w:t>Spreadsheet; makes the coverage test of Section 2.1 auditable</w:t>
+            </w:r>
+            <w:r>
+              <w:rPr>
+                <w:rtl w:val="0"/>
+              </w:rPr>
+            </w:r>
+          </w:p>
+        </w:tc>
+      </w:tr>
     </w:tbl>
     <w:p>
       <w:pPr>
@@ -46509,12 +46711,7 @@
           <w:vertAlign w:val="baseline"/>
           <w:rtl w:val="0"/>
         </w:rPr>
-        <w:t xml:space="preserve">All six are published together with the proof of concept at https://github.com/Lapocalypsie/POC_THESIS: the first four and the editable diagram source under thesis-materials/, the proof of concept itself at the repository root, and the execution evidence under evidence/. The repository also records, in thesis-materials/NOTES_open_items.md, the points on that material that remain open and the reasons for the ones deliberately left as they are.</w:t>
-      </w:r>
-      <w:r>
-        <w:rPr>
-          <w:rtl w:val="0"/>
-        </w:rPr>
+        <w:t>All seven are published together with the proof of concept at https://github.com/Lapocalypsie/POC_THESIS, under 05_PoC/: the first four, the search and screening log and the editable diagram source in 05_PoC/thesis-materials/, the proof of concept itself in 05_PoC/, and the execution evidence in 05_PoC/evidence/. The repository also records, in 05_PoC/thesis-materials/NOTES_open_items.md, the points on that material that remain open and the reasons for the ones deliberately left as they are.</w:t>
       </w:r>
     </w:p>
     <w:sectPr>

</xml_diff>